<commit_message>
add esa 2026 slides (work in progress)
</commit_message>
<xml_diff>
--- a/esa_2026_TT25psf/Perkowski_abstract_v0.1.docx
+++ b/esa_2026_TT25psf/Perkowski_abstract_v0.1.docx
@@ -211,19 +211,13 @@
         <w:t xml:space="preserve">Plant invaders often express unique traits that increase their likelihood of establishment in novel ecosystems. </w:t>
       </w:r>
       <w:r>
-        <w:t xml:space="preserve">Many </w:t>
-      </w:r>
-      <w:r>
-        <w:t xml:space="preserve">plant </w:t>
-      </w:r>
-      <w:r>
-        <w:t>invaders produce antimicrobial compounds that disrupt arbuscular mycorrhizal (AM) fungal communities that native plants rely on for nutrients and water, with effects on nutrient uptake and allocation toward photosynthesis</w:t>
-      </w:r>
-      <w:r>
-        <w:t xml:space="preserve">. </w:t>
-      </w:r>
-      <w:r>
-        <w:t>Garlic mustard (</w:t>
+        <w:t>Many plant invaders produce antimicrobial compounds that disrupt arbuscular mycorrhizal (AM) fungal communities that native plants rely on for nutrients and water, with</w:t>
+      </w:r>
+      <w:r>
+        <w:t xml:space="preserve"> downstream</w:t>
+      </w:r>
+      <w:r>
+        <w:t xml:space="preserve"> effects on nutrient uptake and allocation toward photosynthesis. Garlic mustard (</w:t>
       </w:r>
       <w:proofErr w:type="spellStart"/>
       <w:r>
@@ -242,31 +236,25 @@
         <w:t xml:space="preserve"> petiolata</w:t>
       </w:r>
       <w:r>
-        <w:t xml:space="preserve">), an understory species that has </w:t>
-      </w:r>
-      <w:r>
-        <w:t xml:space="preserve">rapidly </w:t>
-      </w:r>
-      <w:r>
-        <w:t xml:space="preserve">invaded northeastern hardwood forests, produces glucosinolates that kill AM fungal spores and reorganize AM fungal communities, potentially disrupting </w:t>
+        <w:t xml:space="preserve">), an understory species that has rapidly invaded northeastern hardwood forests, produces glucosinolates that kill AM fungal spores and reorganize AM fungal communities, potentially disrupting </w:t>
       </w:r>
       <w:r>
         <w:t xml:space="preserve">native </w:t>
       </w:r>
       <w:r>
-        <w:t>plant</w:t>
-      </w:r>
-      <w:r>
-        <w:t>-</w:t>
-      </w:r>
-      <w:r>
-        <w:t xml:space="preserve">AM fungal symbioses. Garlic mustard presence has also been associated with reduced native plant photosynthesis; however, it remains unclear whether these physiological responses are causally linked to shifts in AM fungal communities or are </w:t>
-      </w:r>
-      <w:r>
-        <w:t xml:space="preserve">instead </w:t>
-      </w:r>
-      <w:r>
-        <w:t xml:space="preserve">driven by other </w:t>
+        <w:t>plant-AM fungal symbioses. Garlic mustard presence has also been associated with reduced native plant photosynthe</w:t>
+      </w:r>
+      <w:r>
+        <w:t>sis and photosynthetic capacity</w:t>
+      </w:r>
+      <w:r>
+        <w:t xml:space="preserve">; however, it remains unclear whether these physiological responses are causally linked to </w:t>
+      </w:r>
+      <w:r>
+        <w:t xml:space="preserve">AM fungal mutualism disruption </w:t>
+      </w:r>
+      <w:r>
+        <w:t xml:space="preserve">or are driven by other </w:t>
       </w:r>
       <w:r>
         <w:t xml:space="preserve">soil characteristics </w:t>
@@ -281,16 +269,7 @@
         <w:t>.</w:t>
       </w:r>
       <w:r>
-        <w:t xml:space="preserve"> </w:t>
-      </w:r>
-      <w:r>
-        <w:t>Here, we assessed these mechanisms using a factorial plant</w:t>
-      </w:r>
-      <w:r>
-        <w:t>-</w:t>
-      </w:r>
-      <w:r>
-        <w:t xml:space="preserve">soil feedback experiment with </w:t>
+        <w:t xml:space="preserve"> Here, we assessed these mechanisms using a factorial plant-soil feedback experiment with </w:t>
       </w:r>
       <w:r>
         <w:rPr>
@@ -306,40 +285,13 @@
         <w:t>treatment</w:t>
       </w:r>
       <w:r>
-        <w:t xml:space="preserve"> </w:t>
-      </w:r>
-      <w:r>
-        <w:t>origin</w:t>
-      </w:r>
-      <w:r>
-        <w:t>).</w:t>
-      </w:r>
-      <w:r>
-        <w:t xml:space="preserve"> </w:t>
-      </w:r>
-      <w:r>
-        <w:t xml:space="preserve">Plants from each </w:t>
+        <w:t xml:space="preserve"> origin). Plants from each </w:t>
       </w:r>
       <w:r>
         <w:t>treatment origin</w:t>
       </w:r>
       <w:r>
-        <w:t xml:space="preserve"> were established in pots that received full-factorial combinations of soils collected from plots where garlic mustard was present or absent (soil origin) and</w:t>
-      </w:r>
-      <w:r>
-        <w:t xml:space="preserve"> </w:t>
-      </w:r>
-      <w:r>
-        <w:t xml:space="preserve">AM fungal inoculum sourced from plots where garlic mustard was present or absent </w:t>
-      </w:r>
-      <w:r>
-        <w:t>(fungal origin</w:t>
-      </w:r>
-      <w:r>
-        <w:t>)</w:t>
-      </w:r>
-      <w:r>
-        <w:t xml:space="preserve">. We collected gas exchange measurements in all individuals upon full leaf expansion to understand whether </w:t>
+        <w:t xml:space="preserve"> were established in pots that received full-factorial combinations of soils collected from plots where garlic mustard was present or absent (soil origin) and AM fungal inoculum sourced from plots where garlic mustard was present or absent (fungal origin). We collected gas exchange measurements in all individuals upon full leaf expansion to understand whether </w:t>
       </w:r>
       <w:r>
         <w:t>treatment</w:t>
@@ -347,346 +299,49 @@
       <w:r>
         <w:t>, soil, or fungal origin drove variance in leaf-level photosynthesis.</w:t>
       </w:r>
-    </w:p>
-    <w:p/>
-    <w:p/>
-    <w:p/>
-    <w:p>
-      <w:r>
-        <w:t>Here, we assessed these mechanisms using a factorial plant</w:t>
-      </w:r>
-      <w:r>
-        <w:t>-</w:t>
-      </w:r>
-      <w:r>
-        <w:t>soil feedback experiment</w:t>
-      </w:r>
-      <w:r>
-        <w:t xml:space="preserve">. </w:t>
-      </w:r>
-      <w:r>
-        <w:rPr>
-          <w:i/>
-          <w:iCs/>
-        </w:rPr>
-        <w:t>Trillium</w:t>
-      </w:r>
-      <w:r>
-        <w:t xml:space="preserve"> spp. i</w:t>
-      </w:r>
-      <w:r>
-        <w:t xml:space="preserve">ndividuals were collected from a long-term field manipulation where garlic mustard was either hand-weeded or left at ambient densities </w:t>
-      </w:r>
-      <w:r>
-        <w:t xml:space="preserve">for two decades. Individuals of each garlic </w:t>
-      </w:r>
-      <w:r>
-        <w:lastRenderedPageBreak/>
-        <w:t xml:space="preserve">mustard field treatment were placed into split pots that contained full-factorial combinations of </w:t>
-      </w:r>
-      <w:r>
-        <w:t>soils from plots where garlic mustard was either present or absent and AM fungal inoculum from plots where garlic mustard was either present or absent.</w:t>
-      </w:r>
-    </w:p>
-    <w:p/>
-    <w:p>
-      <w:r>
-        <w:t>plant history: invader absent vs present) and placed into split pots to decouple bulk soil and symbiont sources. We crossed three factors: plant history, soil origin (soils collected from plots where garlic mustard was present vs absent), and AM fungal inoculum source (live AM fungi sourced from garlic mustard–present vs garlic mustard–absent plots), yielding a 2 × 2 × 2 design. After establishment, we quantified leaf gas exchange and constructed A–Ci curves to estimate photosynthetic capacity parameters, including maximum rates of Rubisco carboxylation (</w:t>
-      </w:r>
-      <w:proofErr w:type="spellStart"/>
-      <w:r>
-        <w:t>Vcmax</w:t>
-      </w:r>
-      <w:proofErr w:type="spellEnd"/>
-      <w:r>
-        <w:t>) and electron transport supporting RuBP regeneration (</w:t>
-      </w:r>
-      <w:proofErr w:type="spellStart"/>
-      <w:r>
-        <w:t>Jmax</w:t>
-      </w:r>
-      <w:proofErr w:type="spellEnd"/>
-      <w:r>
-        <w:t>), alongside net photosynthesis and stomatal conductance.</w:t>
-      </w:r>
-    </w:p>
-    <w:p/>
-    <w:p/>
-    <w:p>
-      <w:r>
-        <w:t>Plant invaders</w:t>
-      </w:r>
-      <w:r>
-        <w:t xml:space="preserve"> often express unique traits that increase their likelihood of establishment in novel ecosystems.</w:t>
-      </w:r>
-      <w:r>
-        <w:t xml:space="preserve"> </w:t>
-      </w:r>
-      <w:r>
-        <w:t>M</w:t>
-      </w:r>
-      <w:r>
-        <w:t>any plant invaders can produc</w:t>
-      </w:r>
-      <w:r>
-        <w:t xml:space="preserve">e </w:t>
-      </w:r>
-      <w:r>
-        <w:t>antimicrobial compounds that disrupt arbuscular mycorrhizal (AM)</w:t>
-      </w:r>
-      <w:r>
-        <w:t xml:space="preserve"> fungal</w:t>
-      </w:r>
-      <w:r>
-        <w:t xml:space="preserve"> communities</w:t>
-      </w:r>
-      <w:r>
-        <w:t xml:space="preserve"> that native plant species rely on for nutrients and </w:t>
-      </w:r>
-      <w:proofErr w:type="gramStart"/>
-      <w:r>
-        <w:t>water, and</w:t>
-      </w:r>
-      <w:proofErr w:type="gramEnd"/>
-      <w:r>
-        <w:t xml:space="preserve"> may also modify soil characteristics important for native plant resource uptake. </w:t>
-      </w:r>
-      <w:proofErr w:type="spellStart"/>
-      <w:r>
-        <w:rPr>
-          <w:i/>
-          <w:iCs/>
-        </w:rPr>
-        <w:t>Alliaria</w:t>
-      </w:r>
-      <w:proofErr w:type="spellEnd"/>
-      <w:r>
-        <w:rPr>
-          <w:i/>
-          <w:iCs/>
-        </w:rPr>
-        <w:t xml:space="preserve"> petiolata</w:t>
-      </w:r>
-      <w:r>
-        <w:t xml:space="preserve"> is a plant invader that releases glucosinolates into soil environments, which kills AM fungal spores and restructures AM fungal community composition. Recent work has shown that these changes are related to shifts in native plant photosynthetic performance, notable reducing indices of photosynthetic capacity and stomatal conductance. However, we do not fully understand whether the disruption of AM fungal communities due to </w:t>
-      </w:r>
-      <w:r>
-        <w:rPr>
-          <w:i/>
-          <w:iCs/>
-        </w:rPr>
-        <w:t>A. petiolata</w:t>
-      </w:r>
-      <w:r>
-        <w:t xml:space="preserve"> presence is the primary mechanism that explains the reduction in photosynthetic processes. Here, we assessed these mechanisms by deploying a plant-soil feedback experiment. </w:t>
-      </w:r>
-      <w:r>
-        <w:rPr>
-          <w:i/>
-          <w:iCs/>
-        </w:rPr>
-        <w:t>Trillium</w:t>
-      </w:r>
-      <w:r>
-        <w:t xml:space="preserve"> spp. </w:t>
-      </w:r>
-      <w:proofErr w:type="spellStart"/>
-      <w:r>
-        <w:t>indviduals</w:t>
-      </w:r>
-      <w:proofErr w:type="spellEnd"/>
-      <w:r>
-        <w:t xml:space="preserve"> were collected from a long-term field experiment where </w:t>
-      </w:r>
-      <w:r>
-        <w:rPr>
-          <w:i/>
-          <w:iCs/>
-        </w:rPr>
-        <w:t>A. petiolata</w:t>
-      </w:r>
-      <w:r>
-        <w:t xml:space="preserve"> was hand-weeded or left at ambient densities and placed into split pots </w:t>
-      </w:r>
-    </w:p>
-    <w:p/>
-    <w:p>
-      <w:r>
-        <w:t xml:space="preserve">an invasive species with widespread distributions in the northeastern United States, has rapidly </w:t>
-      </w:r>
-      <w:proofErr w:type="spellStart"/>
-      <w:r>
-        <w:t>esta</w:t>
-      </w:r>
-      <w:proofErr w:type="spellEnd"/>
     </w:p>
     <w:p>
-      <w:pPr>
-        <w:rPr>
-          <w:i/>
-          <w:iCs/>
-        </w:rPr>
-      </w:pPr>
+      <w:r>
+        <w:t xml:space="preserve">Fungal source drove photosynthetic responses to treatment combinations. Specifically, net photosynthesis </w:t>
+      </w:r>
+      <w:r>
+        <w:t>was</w:t>
+      </w:r>
+      <w:r>
+        <w:t xml:space="preserve"> reduced</w:t>
+      </w:r>
+      <w:r>
+        <w:t xml:space="preserve"> by 70%</w:t>
+      </w:r>
+      <w:r>
+        <w:t xml:space="preserve"> in plants that received the non-weeded AM fungal inoculum compared to the weeded AM fungal inoculum, but this response was only observed when plants grew in soils from the weeded treatment. </w:t>
+      </w:r>
+      <w:r>
+        <w:t>Net photosynthetic responses</w:t>
+      </w:r>
+      <w:r>
+        <w:t xml:space="preserve"> </w:t>
+      </w:r>
+      <w:r>
+        <w:t>were</w:t>
+      </w:r>
+      <w:r>
+        <w:t xml:space="preserve"> driven by a reduction in photosynthetic capacity and no change in stomatal conductance, where the maximum rates of Rubisco carboxylation and electron transport for RuBP regeneration were significantly reduced in plants that received the non-weeded AM fungal inoculum. Again, this </w:t>
+      </w:r>
+      <w:r>
+        <w:lastRenderedPageBreak/>
+        <w:t>response was only observed when plants grew in soils from the weeded garlic mustard treatment. Overall, these findings support the notion that AM fungal mutualism disruption is the mechanism that explains why native plants reduce photosynthetic processes in response to garlic mustard presence</w:t>
+      </w:r>
+      <w:r>
+        <w:t>, though notes that there is some role in soil characteristics that underpin this response</w:t>
+      </w:r>
+      <w:r>
+        <w:t>.</w:t>
+      </w:r>
+      <w:r>
+        <w:t xml:space="preserve"> Ongoing work is centered around determining which soil characteristics contribute to this interaction. Results from this experiment are useful for determining the mechanisms that drive native plant responses to garlic mustard, but also provide nuanced insight into understanding how patterns that impact soil microbial communities scale to impact plant physiology and broader levels of ecology.</w:t>
+      </w:r>
     </w:p>
-    <w:p>
-      <w:pPr>
-        <w:rPr>
-          <w:i/>
-          <w:iCs/>
-        </w:rPr>
-      </w:pPr>
-      <w:proofErr w:type="spellStart"/>
-      <w:r>
-        <w:rPr>
-          <w:rStyle w:val="Emphasis"/>
-          <w:rFonts w:eastAsiaTheme="majorEastAsia"/>
-          <w:color w:val="0E101A"/>
-        </w:rPr>
-        <w:t>Alliaria</w:t>
-      </w:r>
-      <w:proofErr w:type="spellEnd"/>
-      <w:r>
-        <w:rPr>
-          <w:rStyle w:val="Emphasis"/>
-          <w:rFonts w:eastAsiaTheme="majorEastAsia"/>
-          <w:color w:val="0E101A"/>
-        </w:rPr>
-        <w:t xml:space="preserve"> petiolata</w:t>
-      </w:r>
-      <w:r>
-        <w:t>, an allelopathic invader that reorganizes AM fungal communities by secreting glucosinolates belowground, negatively affected leaf gas exchange in two native understory AM-associating plant species (</w:t>
-      </w:r>
-      <w:r>
-        <w:rPr>
-          <w:rStyle w:val="Emphasis"/>
-          <w:rFonts w:eastAsiaTheme="majorEastAsia"/>
-          <w:color w:val="0E101A"/>
-        </w:rPr>
-        <w:t xml:space="preserve">Maianthemum </w:t>
-      </w:r>
-      <w:proofErr w:type="spellStart"/>
-      <w:r>
-        <w:rPr>
-          <w:rStyle w:val="Emphasis"/>
-          <w:rFonts w:eastAsiaTheme="majorEastAsia"/>
-          <w:color w:val="0E101A"/>
-        </w:rPr>
-        <w:t>racemosum</w:t>
-      </w:r>
-      <w:proofErr w:type="spellEnd"/>
-      <w:r>
-        <w:t xml:space="preserve"> and </w:t>
-      </w:r>
-      <w:r>
-        <w:rPr>
-          <w:rStyle w:val="Emphasis"/>
-          <w:rFonts w:eastAsiaTheme="majorEastAsia"/>
-          <w:color w:val="0E101A"/>
-        </w:rPr>
-        <w:t>Trillium</w:t>
-      </w:r>
-      <w:r>
-        <w:t xml:space="preserve"> spp.) growing in a long-term </w:t>
-      </w:r>
-      <w:r>
-        <w:rPr>
-          <w:rStyle w:val="Emphasis"/>
-          <w:rFonts w:eastAsiaTheme="majorEastAsia"/>
-          <w:color w:val="0E101A"/>
-        </w:rPr>
-        <w:t xml:space="preserve">A. petiolata </w:t>
-      </w:r>
-      <w:r>
-        <w:t>field manipulation experiment</w:t>
-      </w:r>
-    </w:p>
-    <w:p/>
-    <w:p>
-      <w:pPr>
-        <w:spacing w:line="360" w:lineRule="auto"/>
-      </w:pPr>
-      <w:r>
-        <w:t xml:space="preserve">Invasive plants often express unique traits that increase their likelihood of establishment in novel ecosystems. Allelopathy, defined as a secondary compound produced by a plant that negatively impacts neighboring plant species and/or soil microbial communities, has emerged as a mechanism to explain the success of some invasive plant species. Allelopathy is estimated to occur in 52% of invasive plant species </w:t>
-      </w:r>
-      <w:sdt>
-        <w:sdtPr>
-          <w:rPr>
-            <w:color w:val="000000"/>
-          </w:rPr>
-          <w:tag w:val="MENDELEY_CITATION_v3_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"/>
-          <w:id w:val="953447319"/>
-          <w:placeholder>
-            <w:docPart w:val="8BBDCC4D00756E45BDCA6EB80A2E474B"/>
-          </w:placeholder>
-        </w:sdtPr>
-        <w:sdtContent>
-          <w:r>
-            <w:rPr>
-              <w:color w:val="000000"/>
-            </w:rPr>
-            <w:t>(Kalisz et al., 2021)</w:t>
-          </w:r>
-        </w:sdtContent>
-      </w:sdt>
-      <w:ins w:id="0" w:author="Perkowski, Evan A" w:date="2025-07-01T16:37:00Z" w16du:dateUtc="2025-07-01T21:37:00Z">
-        <w:r>
-          <w:rPr>
-            <w:color w:val="000000"/>
-          </w:rPr>
-          <w:t xml:space="preserve"> and has been shown to negatively affect native plant performance and soil microbial community composition in both field and greenhouse settings</w:t>
-        </w:r>
-      </w:ins>
-      <w:r>
-        <w:rPr>
-          <w:color w:val="000000"/>
-        </w:rPr>
-        <w:t xml:space="preserve"> </w:t>
-      </w:r>
-      <w:sdt>
-        <w:sdtPr>
-          <w:rPr>
-            <w:color w:val="000000"/>
-          </w:rPr>
-          <w:tag w:val="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"/>
-          <w:id w:val="-111678887"/>
-          <w:placeholder>
-            <w:docPart w:val="1105933E8614794DB18B68A0B150C3F8"/>
-          </w:placeholder>
-        </w:sdtPr>
-        <w:sdtContent>
-          <w:r>
-            <w:rPr>
-              <w:color w:val="000000"/>
-            </w:rPr>
-            <w:t>(</w:t>
-          </w:r>
-          <w:proofErr w:type="spellStart"/>
-          <w:r>
-            <w:rPr>
-              <w:color w:val="000000"/>
-            </w:rPr>
-            <w:t>Bialic</w:t>
-          </w:r>
-          <w:proofErr w:type="spellEnd"/>
-          <w:r>
-            <w:rPr>
-              <w:color w:val="000000"/>
-            </w:rPr>
-            <w:t>-Murphy et al., 2020, 2021; Brouwer et al., 2015; Hale et al., 2011, 2016; Hale &amp; Kalisz, 2012; Qu et al., 2021; Roche et al., 2021; Zhang et al., 2021)</w:t>
-          </w:r>
-        </w:sdtContent>
-      </w:sdt>
-      <w:r>
-        <w:t>. Despite the prevalence of allelopathy among invasive species, our understanding of</w:t>
-      </w:r>
-      <w:r>
-        <w:t xml:space="preserve"> the mechanisms that drive the physiological responses of native species to allelopathic invasion and the temporal dynamics that underpin these responses remains limited. </w:t>
-      </w:r>
-      <w:r>
-        <w:t>This knowledge gap hinders our understanding of how the disruptive impacts of allelopathic invasion on soil microbial communities scale to influence plant community dynamics.</w:t>
-      </w:r>
-    </w:p>
-    <w:p/>
     <w:sectPr>
       <w:pgSz w:w="12240" w:h="15840"/>
       <w:pgMar w:top="1440" w:right="1440" w:bottom="1440" w:left="1440" w:header="720" w:footer="720" w:gutter="0"/>
@@ -695,14 +350,6 @@
     </w:sectPr>
   </w:body>
 </w:document>
-</file>
-
-<file path=word/people.xml><?xml version="1.0" encoding="utf-8"?>
-<w15:people xmlns:wpc="http://schemas.microsoft.com/office/word/2010/wordprocessingCanvas" xmlns:cx="http://schemas.microsoft.com/office/drawing/2014/chartex" xmlns:cx1="http://schemas.microsoft.com/office/drawing/2015/9/8/chartex" xmlns:cx2="http://schemas.microsoft.com/office/drawing/2015/10/21/chartex" xmlns:cx3="http://schemas.microsoft.com/office/drawing/2016/5/9/chartex" xmlns:cx4="http://schemas.microsoft.com/office/drawing/2016/5/10/chartex" xmlns:cx5="http://schemas.microsoft.com/office/drawing/2016/5/11/chartex" xmlns:cx6="http://schemas.microsoft.com/office/drawing/2016/5/12/chartex" xmlns:cx7="http://schemas.microsoft.com/office/drawing/2016/5/13/chartex" xmlns:cx8="http://schemas.microsoft.com/office/drawing/2016/5/14/chartex" xmlns:mc="http://schemas.openxmlformats.org/markup-compatibility/2006" xmlns:aink="http://schemas.microsoft.com/office/drawing/2016/ink" xmlns:am3d="http://schemas.microsoft.com/office/drawing/2017/model3d" xmlns:o="urn:schemas-microsoft-com:office:office" xmlns:oel="http://schemas.microsoft.com/office/2019/extlst" xmlns:r="http://schemas.openxmlformats.org/officeDocument/2006/relationships" xmlns:m="http://schemas.openxmlformats.org/officeDocument/2006/math" xmlns:v="urn:schemas-microsoft-com:vml" xmlns:wp14="http://schemas.microsoft.com/office/word/2010/wordprocessingDrawing" xmlns:wp="http://schemas.openxmlformats.org/drawingml/2006/wordprocessingDrawing" xmlns:w10="urn:schemas-microsoft-com:office:word" xmlns:w="http://schemas.openxmlformats.org/wordprocessingml/2006/main" xmlns:w14="http://schemas.microsoft.com/office/word/2010/wordml" xmlns:w15="http://schemas.microsoft.com/office/word/2012/wordml" xmlns:w16cex="http://schemas.microsoft.com/office/word/2018/wordml/cex" xmlns:w16cid="http://schemas.microsoft.com/office/word/2016/wordml/cid" xmlns:w16="http://schemas.microsoft.com/office/word/2018/wordml" xmlns:w16du="http://schemas.microsoft.com/office/word/2023/wordml/word16du" xmlns:w16sdtdh="http://schemas.microsoft.com/office/word/2020/wordml/sdtdatahash" xmlns:w16sdtfl="http://schemas.microsoft.com/office/word/2024/wordml/sdtformatlock" xmlns:w16se="http://schemas.microsoft.com/office/word/2015/wordml/symex" xmlns:wpg="http://schemas.microsoft.com/office/word/2010/wordprocessingGroup" xmlns:wpi="http://schemas.microsoft.com/office/word/2010/wordprocessingInk" xmlns:wne="http://schemas.microsoft.com/office/word/2006/wordml" xmlns:wps="http://schemas.microsoft.com/office/word/2010/wordprocessingShape" mc:Ignorable="w14 w15 w16se w16cid w16 w16cex w16sdtdh w16sdtfl w16du wp14">
-  <w15:person w15:author="Perkowski, Evan A">
-    <w15:presenceInfo w15:providerId="AD" w15:userId="S::Evan.A.Perkowski@ttu.edu::60f99932-1f8b-47fd-ae71-548bdb6d48d3"/>
-  </w15:person>
-</w15:people>
 </file>
 
 <file path=word/styles.xml><?xml version="1.0" encoding="utf-8"?>
@@ -1636,594 +1283,6 @@
 </w:styles>
 </file>
 
-<file path=word/glossary/document.xml><?xml version="1.0" encoding="utf-8"?>
-<w:glossaryDocument xmlns:wpc="http://schemas.microsoft.com/office/word/2010/wordprocessingCanvas" xmlns:cx="http://schemas.microsoft.com/office/drawing/2014/chartex" xmlns:cx1="http://schemas.microsoft.com/office/drawing/2015/9/8/chartex" xmlns:cx2="http://schemas.microsoft.com/office/drawing/2015/10/21/chartex" xmlns:cx3="http://schemas.microsoft.com/office/drawing/2016/5/9/chartex" xmlns:cx4="http://schemas.microsoft.com/office/drawing/2016/5/10/chartex" xmlns:cx5="http://schemas.microsoft.com/office/drawing/2016/5/11/chartex" xmlns:cx6="http://schemas.microsoft.com/office/drawing/2016/5/12/chartex" xmlns:cx7="http://schemas.microsoft.com/office/drawing/2016/5/13/chartex" xmlns:cx8="http://schemas.microsoft.com/office/drawing/2016/5/14/chartex" xmlns:mc="http://schemas.openxmlformats.org/markup-compatibility/2006" xmlns:aink="http://schemas.microsoft.com/office/drawing/2016/ink" xmlns:am3d="http://schemas.microsoft.com/office/drawing/2017/model3d" xmlns:o="urn:schemas-microsoft-com:office:office" xmlns:oel="http://schemas.microsoft.com/office/2019/extlst" xmlns:r="http://schemas.openxmlformats.org/officeDocument/2006/relationships" xmlns:m="http://schemas.openxmlformats.org/officeDocument/2006/math" xmlns:v="urn:schemas-microsoft-com:vml" xmlns:wp14="http://schemas.microsoft.com/office/word/2010/wordprocessingDrawing" xmlns:wp="http://schemas.openxmlformats.org/drawingml/2006/wordprocessingDrawing" xmlns:w10="urn:schemas-microsoft-com:office:word" xmlns:w="http://schemas.openxmlformats.org/wordprocessingml/2006/main" xmlns:w14="http://schemas.microsoft.com/office/word/2010/wordml" xmlns:w15="http://schemas.microsoft.com/office/word/2012/wordml" xmlns:w16cex="http://schemas.microsoft.com/office/word/2018/wordml/cex" xmlns:w16cid="http://schemas.microsoft.com/office/word/2016/wordml/cid" xmlns:w16="http://schemas.microsoft.com/office/word/2018/wordml" xmlns:w16du="http://schemas.microsoft.com/office/word/2023/wordml/word16du" xmlns:w16sdtdh="http://schemas.microsoft.com/office/word/2020/wordml/sdtdatahash" xmlns:w16sdtfl="http://schemas.microsoft.com/office/word/2024/wordml/sdtformatlock" xmlns:w16se="http://schemas.microsoft.com/office/word/2015/wordml/symex" xmlns:wpg="http://schemas.microsoft.com/office/word/2010/wordprocessingGroup" xmlns:wpi="http://schemas.microsoft.com/office/word/2010/wordprocessingInk" xmlns:wne="http://schemas.microsoft.com/office/word/2006/wordml" xmlns:wps="http://schemas.microsoft.com/office/word/2010/wordprocessingShape" mc:Ignorable="w14 w15 w16se w16cid w16 w16cex w16sdtdh w16sdtfl w16du wp14">
-  <w:docParts>
-    <w:docPart>
-      <w:docPartPr>
-        <w:name w:val="8BBDCC4D00756E45BDCA6EB80A2E474B"/>
-        <w:category>
-          <w:name w:val="General"/>
-          <w:gallery w:val="placeholder"/>
-        </w:category>
-        <w:types>
-          <w:type w:val="bbPlcHdr"/>
-        </w:types>
-        <w:behaviors>
-          <w:behavior w:val="content"/>
-        </w:behaviors>
-        <w:guid w:val="{9B735A8A-98D1-AE41-B933-1AE5E548DF2E}"/>
-      </w:docPartPr>
-      <w:docPartBody>
-        <w:p>
-          <w:pPr>
-            <w:pStyle w:val="8BBDCC4D00756E45BDCA6EB80A2E474B"/>
-          </w:pPr>
-          <w:r>
-            <w:rPr>
-              <w:rStyle w:val="PlaceholderText"/>
-            </w:rPr>
-            <w:t>Click or tap here to enter text.</w:t>
-          </w:r>
-        </w:p>
-      </w:docPartBody>
-    </w:docPart>
-    <w:docPart>
-      <w:docPartPr>
-        <w:name w:val="1105933E8614794DB18B68A0B150C3F8"/>
-        <w:category>
-          <w:name w:val="General"/>
-          <w:gallery w:val="placeholder"/>
-        </w:category>
-        <w:types>
-          <w:type w:val="bbPlcHdr"/>
-        </w:types>
-        <w:behaviors>
-          <w:behavior w:val="content"/>
-        </w:behaviors>
-        <w:guid w:val="{BAE011AE-198A-1846-AD8B-F8FA56F0D5E8}"/>
-      </w:docPartPr>
-      <w:docPartBody>
-        <w:p>
-          <w:pPr>
-            <w:pStyle w:val="1105933E8614794DB18B68A0B150C3F8"/>
-          </w:pPr>
-          <w:r>
-            <w:rPr>
-              <w:rStyle w:val="PlaceholderText"/>
-            </w:rPr>
-            <w:t>Click or tap here to enter text.</w:t>
-          </w:r>
-        </w:p>
-      </w:docPartBody>
-    </w:docPart>
-  </w:docParts>
-</w:glossaryDocument>
-</file>
-
-<file path=word/glossary/fontTable.xml><?xml version="1.0" encoding="utf-8"?>
-<w:fonts xmlns:mc="http://schemas.openxmlformats.org/markup-compatibility/2006" xmlns:r="http://schemas.openxmlformats.org/officeDocument/2006/relationships" xmlns:w="http://schemas.openxmlformats.org/wordprocessingml/2006/main" xmlns:w14="http://schemas.microsoft.com/office/word/2010/wordml" xmlns:w15="http://schemas.microsoft.com/office/word/2012/wordml" xmlns:w16cex="http://schemas.microsoft.com/office/word/2018/wordml/cex" xmlns:w16cid="http://schemas.microsoft.com/office/word/2016/wordml/cid" xmlns:w16="http://schemas.microsoft.com/office/word/2018/wordml" xmlns:w16du="http://schemas.microsoft.com/office/word/2023/wordml/word16du" xmlns:w16sdtdh="http://schemas.microsoft.com/office/word/2020/wordml/sdtdatahash" xmlns:w16sdtfl="http://schemas.microsoft.com/office/word/2024/wordml/sdtformatlock" xmlns:w16se="http://schemas.microsoft.com/office/word/2015/wordml/symex" mc:Ignorable="w14 w15 w16se w16cid w16 w16cex w16sdtdh w16sdtfl w16du">
-  <w:font w:name="Times New Roman">
-    <w:panose1 w:val="02020603050405020304"/>
-    <w:charset w:val="00"/>
-    <w:family w:val="roman"/>
-    <w:pitch w:val="variable"/>
-    <w:sig w:usb0="E0002EFF" w:usb1="C000785B" w:usb2="00000009" w:usb3="00000000" w:csb0="000001FF" w:csb1="00000000"/>
-  </w:font>
-  <w:font w:name="Aptos">
-    <w:panose1 w:val="020B0004020202020204"/>
-    <w:charset w:val="00"/>
-    <w:family w:val="swiss"/>
-    <w:pitch w:val="variable"/>
-    <w:sig w:usb0="20000287" w:usb1="00000003" w:usb2="00000000" w:usb3="00000000" w:csb0="0000019F" w:csb1="00000000"/>
-  </w:font>
-  <w:font w:name="Aptos Display">
-    <w:panose1 w:val="020B0004020202020204"/>
-    <w:charset w:val="00"/>
-    <w:family w:val="swiss"/>
-    <w:pitch w:val="variable"/>
-    <w:sig w:usb0="20000287" w:usb1="00000003" w:usb2="00000000" w:usb3="00000000" w:csb0="0000019F" w:csb1="00000000"/>
-  </w:font>
-</w:fonts>
-</file>
-
-<file path=word/glossary/settings.xml><?xml version="1.0" encoding="utf-8"?>
-<w:settings xmlns:mc="http://schemas.openxmlformats.org/markup-compatibility/2006" xmlns:o="urn:schemas-microsoft-com:office:office" xmlns:r="http://schemas.openxmlformats.org/officeDocument/2006/relationships" xmlns:m="http://schemas.openxmlformats.org/officeDocument/2006/math" xmlns:v="urn:schemas-microsoft-com:vml" xmlns:w10="urn:schemas-microsoft-com:office:word" xmlns:w="http://schemas.openxmlformats.org/wordprocessingml/2006/main" xmlns:w14="http://schemas.microsoft.com/office/word/2010/wordml" xmlns:w15="http://schemas.microsoft.com/office/word/2012/wordml" xmlns:w16cex="http://schemas.microsoft.com/office/word/2018/wordml/cex" xmlns:w16cid="http://schemas.microsoft.com/office/word/2016/wordml/cid" xmlns:w16="http://schemas.microsoft.com/office/word/2018/wordml" xmlns:w16du="http://schemas.microsoft.com/office/word/2023/wordml/word16du" xmlns:w16sdtdh="http://schemas.microsoft.com/office/word/2020/wordml/sdtdatahash" xmlns:w16sdtfl="http://schemas.microsoft.com/office/word/2024/wordml/sdtformatlock" xmlns:w16se="http://schemas.microsoft.com/office/word/2015/wordml/symex" xmlns:sl="http://schemas.openxmlformats.org/schemaLibrary/2006/main" mc:Ignorable="w14 w15 w16se w16cid w16 w16cex w16sdtdh w16sdtfl w16du">
-  <w:view w:val="normal"/>
-  <w:defaultTabStop w:val="720"/>
-  <w:characterSpacingControl w:val="doNotCompress"/>
-  <w:compat>
-    <w:useFELayout/>
-    <w:compatSetting w:name="compatibilityMode" w:uri="http://schemas.microsoft.com/office/word" w:val="15"/>
-    <w:compatSetting w:name="overrideTableStyleFontSizeAndJustification" w:uri="http://schemas.microsoft.com/office/word" w:val="1"/>
-    <w:compatSetting w:name="enableOpenTypeFeatures" w:uri="http://schemas.microsoft.com/office/word" w:val="1"/>
-    <w:compatSetting w:name="doNotFlipMirrorIndents" w:uri="http://schemas.microsoft.com/office/word" w:val="1"/>
-    <w:compatSetting w:name="differentiateMultirowTableHeaders" w:uri="http://schemas.microsoft.com/office/word" w:val="1"/>
-    <w:compatSetting w:name="useWord2013TrackBottomHyphenation" w:uri="http://schemas.microsoft.com/office/word" w:val="0"/>
-  </w:compat>
-  <w:rsids>
-    <w:rsidRoot w:val="0060203E"/>
-    <w:rsid w:val="002206D7"/>
-    <w:rsid w:val="0060203E"/>
-    <w:rsid w:val="00772D13"/>
-  </w:rsids>
-  <m:mathPr>
-    <m:mathFont m:val="Cambria Math"/>
-    <m:brkBin m:val="before"/>
-    <m:brkBinSub m:val="--"/>
-    <m:smallFrac m:val="0"/>
-    <m:dispDef/>
-    <m:lMargin m:val="0"/>
-    <m:rMargin m:val="0"/>
-    <m:defJc m:val="centerGroup"/>
-    <m:wrapIndent m:val="1440"/>
-    <m:intLim m:val="subSup"/>
-    <m:naryLim m:val="undOvr"/>
-  </m:mathPr>
-  <w:themeFontLang w:val="en-US"/>
-  <w:clrSchemeMapping w:bg1="light1" w:t1="dark1" w:bg2="light2" w:t2="dark2" w:accent1="accent1" w:accent2="accent2" w:accent3="accent3" w:accent4="accent4" w:accent5="accent5" w:accent6="accent6" w:hyperlink="hyperlink" w:followedHyperlink="followedHyperlink"/>
-  <w:decimalSymbol w:val="."/>
-  <w:listSeparator w:val=","/>
-  <w15:chartTrackingRefBased/>
-</w:settings>
-</file>
-
-<file path=word/glossary/styles.xml><?xml version="1.0" encoding="utf-8"?>
-<w:styles xmlns:mc="http://schemas.openxmlformats.org/markup-compatibility/2006" xmlns:r="http://schemas.openxmlformats.org/officeDocument/2006/relationships" xmlns:w="http://schemas.openxmlformats.org/wordprocessingml/2006/main" xmlns:w14="http://schemas.microsoft.com/office/word/2010/wordml" xmlns:w15="http://schemas.microsoft.com/office/word/2012/wordml" xmlns:w16cex="http://schemas.microsoft.com/office/word/2018/wordml/cex" xmlns:w16cid="http://schemas.microsoft.com/office/word/2016/wordml/cid" xmlns:w16="http://schemas.microsoft.com/office/word/2018/wordml" xmlns:w16du="http://schemas.microsoft.com/office/word/2023/wordml/word16du" xmlns:w16sdtdh="http://schemas.microsoft.com/office/word/2020/wordml/sdtdatahash" xmlns:w16sdtfl="http://schemas.microsoft.com/office/word/2024/wordml/sdtformatlock" xmlns:w16se="http://schemas.microsoft.com/office/word/2015/wordml/symex" mc:Ignorable="w14 w15 w16se w16cid w16 w16cex w16sdtdh w16sdtfl w16du">
-  <w:docDefaults>
-    <w:rPrDefault>
-      <w:rPr>
-        <w:rFonts w:asciiTheme="minorHAnsi" w:eastAsiaTheme="minorEastAsia" w:hAnsiTheme="minorHAnsi" w:cstheme="minorBidi"/>
-        <w:kern w:val="2"/>
-        <w:sz w:val="24"/>
-        <w:szCs w:val="24"/>
-        <w:lang w:val="en-US" w:eastAsia="en-US" w:bidi="ar-SA"/>
-        <w14:ligatures w14:val="standardContextual"/>
-      </w:rPr>
-    </w:rPrDefault>
-    <w:pPrDefault>
-      <w:pPr>
-        <w:spacing w:after="160" w:line="278" w:lineRule="auto"/>
-      </w:pPr>
-    </w:pPrDefault>
-  </w:docDefaults>
-  <w:latentStyles w:defLockedState="0" w:defUIPriority="99" w:defSemiHidden="0" w:defUnhideWhenUsed="0" w:defQFormat="0" w:count="376">
-    <w:lsdException w:name="Normal" w:uiPriority="0" w:qFormat="1"/>
-    <w:lsdException w:name="heading 1" w:uiPriority="9" w:qFormat="1"/>
-    <w:lsdException w:name="heading 2" w:semiHidden="1" w:uiPriority="9" w:unhideWhenUsed="1" w:qFormat="1"/>
-    <w:lsdException w:name="heading 3" w:semiHidden="1" w:uiPriority="9" w:unhideWhenUsed="1" w:qFormat="1"/>
-    <w:lsdException w:name="heading 4" w:semiHidden="1" w:uiPriority="9" w:unhideWhenUsed="1" w:qFormat="1"/>
-    <w:lsdException w:name="heading 5" w:semiHidden="1" w:uiPriority="9" w:unhideWhenUsed="1" w:qFormat="1"/>
-    <w:lsdException w:name="heading 6" w:semiHidden="1" w:uiPriority="9" w:unhideWhenUsed="1" w:qFormat="1"/>
-    <w:lsdException w:name="heading 7" w:semiHidden="1" w:uiPriority="9" w:unhideWhenUsed="1" w:qFormat="1"/>
-    <w:lsdException w:name="heading 8" w:semiHidden="1" w:uiPriority="9" w:unhideWhenUsed="1" w:qFormat="1"/>
-    <w:lsdException w:name="heading 9" w:semiHidden="1" w:uiPriority="9" w:unhideWhenUsed="1" w:qFormat="1"/>
-    <w:lsdException w:name="index 1" w:semiHidden="1" w:unhideWhenUsed="1"/>
-    <w:lsdException w:name="index 2" w:semiHidden="1" w:unhideWhenUsed="1"/>
-    <w:lsdException w:name="index 3" w:semiHidden="1" w:unhideWhenUsed="1"/>
-    <w:lsdException w:name="index 4" w:semiHidden="1" w:unhideWhenUsed="1"/>
-    <w:lsdException w:name="index 5" w:semiHidden="1" w:unhideWhenUsed="1"/>
-    <w:lsdException w:name="index 6" w:semiHidden="1" w:unhideWhenUsed="1"/>
-    <w:lsdException w:name="index 7" w:semiHidden="1" w:unhideWhenUsed="1"/>
-    <w:lsdException w:name="index 8" w:semiHidden="1" w:unhideWhenUsed="1"/>
-    <w:lsdException w:name="index 9" w:semiHidden="1" w:unhideWhenUsed="1"/>
-    <w:lsdException w:name="toc 1" w:semiHidden="1" w:uiPriority="39" w:unhideWhenUsed="1"/>
-    <w:lsdException w:name="toc 2" w:semiHidden="1" w:uiPriority="39" w:unhideWhenUsed="1"/>
-    <w:lsdException w:name="toc 3" w:semiHidden="1" w:uiPriority="39" w:unhideWhenUsed="1"/>
-    <w:lsdException w:name="toc 4" w:semiHidden="1" w:uiPriority="39" w:unhideWhenUsed="1"/>
-    <w:lsdException w:name="toc 5" w:semiHidden="1" w:uiPriority="39" w:unhideWhenUsed="1"/>
-    <w:lsdException w:name="toc 6" w:semiHidden="1" w:uiPriority="39" w:unhideWhenUsed="1"/>
-    <w:lsdException w:name="toc 7" w:semiHidden="1" w:uiPriority="39" w:unhideWhenUsed="1"/>
-    <w:lsdException w:name="toc 8" w:semiHidden="1" w:uiPriority="39" w:unhideWhenUsed="1"/>
-    <w:lsdException w:name="toc 9" w:semiHidden="1" w:uiPriority="39" w:unhideWhenUsed="1"/>
-    <w:lsdException w:name="Normal Indent" w:semiHidden="1" w:unhideWhenUsed="1"/>
-    <w:lsdException w:name="footnote text" w:semiHidden="1" w:unhideWhenUsed="1"/>
-    <w:lsdException w:name="annotation text" w:semiHidden="1" w:unhideWhenUsed="1"/>
-    <w:lsdException w:name="header" w:semiHidden="1" w:unhideWhenUsed="1"/>
-    <w:lsdException w:name="footer" w:semiHidden="1" w:unhideWhenUsed="1"/>
-    <w:lsdException w:name="index heading" w:semiHidden="1" w:unhideWhenUsed="1"/>
-    <w:lsdException w:name="caption" w:semiHidden="1" w:uiPriority="35" w:unhideWhenUsed="1" w:qFormat="1"/>
-    <w:lsdException w:name="table of figures" w:semiHidden="1" w:unhideWhenUsed="1"/>
-    <w:lsdException w:name="envelope address" w:semiHidden="1" w:unhideWhenUsed="1"/>
-    <w:lsdException w:name="envelope return" w:semiHidden="1" w:unhideWhenUsed="1"/>
-    <w:lsdException w:name="footnote reference" w:semiHidden="1" w:unhideWhenUsed="1"/>
-    <w:lsdException w:name="annotation reference" w:semiHidden="1" w:unhideWhenUsed="1"/>
-    <w:lsdException w:name="line number" w:semiHidden="1" w:unhideWhenUsed="1"/>
-    <w:lsdException w:name="page number" w:semiHidden="1" w:unhideWhenUsed="1"/>
-    <w:lsdException w:name="endnote reference" w:semiHidden="1" w:unhideWhenUsed="1"/>
-    <w:lsdException w:name="endnote text" w:semiHidden="1" w:unhideWhenUsed="1"/>
-    <w:lsdException w:name="table of authorities" w:semiHidden="1" w:unhideWhenUsed="1"/>
-    <w:lsdException w:name="macro" w:semiHidden="1" w:unhideWhenUsed="1"/>
-    <w:lsdException w:name="toa heading" w:semiHidden="1" w:unhideWhenUsed="1"/>
-    <w:lsdException w:name="List" w:semiHidden="1" w:unhideWhenUsed="1"/>
-    <w:lsdException w:name="List Bullet" w:semiHidden="1" w:unhideWhenUsed="1"/>
-    <w:lsdException w:name="List Number" w:semiHidden="1" w:unhideWhenUsed="1"/>
-    <w:lsdException w:name="List 2" w:semiHidden="1" w:unhideWhenUsed="1"/>
-    <w:lsdException w:name="List 3" w:semiHidden="1" w:unhideWhenUsed="1"/>
-    <w:lsdException w:name="List 4" w:semiHidden="1" w:unhideWhenUsed="1"/>
-    <w:lsdException w:name="List 5" w:semiHidden="1" w:unhideWhenUsed="1"/>
-    <w:lsdException w:name="List Bullet 2" w:semiHidden="1" w:unhideWhenUsed="1"/>
-    <w:lsdException w:name="List Bullet 3" w:semiHidden="1" w:unhideWhenUsed="1"/>
-    <w:lsdException w:name="List Bullet 4" w:semiHidden="1" w:unhideWhenUsed="1"/>
-    <w:lsdException w:name="List Bullet 5" w:semiHidden="1" w:unhideWhenUsed="1"/>
-    <w:lsdException w:name="List Number 2" w:semiHidden="1" w:unhideWhenUsed="1"/>
-    <w:lsdException w:name="List Number 3" w:semiHidden="1" w:unhideWhenUsed="1"/>
-    <w:lsdException w:name="List Number 4" w:semiHidden="1" w:unhideWhenUsed="1"/>
-    <w:lsdException w:name="List Number 5" w:semiHidden="1" w:unhideWhenUsed="1"/>
-    <w:lsdException w:name="Title" w:uiPriority="10" w:qFormat="1"/>
-    <w:lsdException w:name="Closing" w:semiHidden="1" w:unhideWhenUsed="1"/>
-    <w:lsdException w:name="Signature" w:semiHidden="1" w:unhideWhenUsed="1"/>
-    <w:lsdException w:name="Default Paragraph Font" w:semiHidden="1" w:uiPriority="1" w:unhideWhenUsed="1"/>
-    <w:lsdException w:name="Body Text" w:semiHidden="1" w:unhideWhenUsed="1"/>
-    <w:lsdException w:name="Body Text Indent" w:semiHidden="1" w:unhideWhenUsed="1"/>
-    <w:lsdException w:name="List Continue" w:semiHidden="1" w:unhideWhenUsed="1"/>
-    <w:lsdException w:name="List Continue 2" w:semiHidden="1" w:unhideWhenUsed="1"/>
-    <w:lsdException w:name="List Continue 3" w:semiHidden="1" w:unhideWhenUsed="1"/>
-    <w:lsdException w:name="List Continue 4" w:semiHidden="1" w:unhideWhenUsed="1"/>
-    <w:lsdException w:name="List Continue 5" w:semiHidden="1" w:unhideWhenUsed="1"/>
-    <w:lsdException w:name="Message Header" w:semiHidden="1" w:unhideWhenUsed="1"/>
-    <w:lsdException w:name="Subtitle" w:uiPriority="11" w:qFormat="1"/>
-    <w:lsdException w:name="Salutation" w:semiHidden="1" w:unhideWhenUsed="1"/>
-    <w:lsdException w:name="Date" w:semiHidden="1" w:unhideWhenUsed="1"/>
-    <w:lsdException w:name="Body Text First Indent" w:semiHidden="1" w:unhideWhenUsed="1"/>
-    <w:lsdException w:name="Body Text First Indent 2" w:semiHidden="1" w:unhideWhenUsed="1"/>
-    <w:lsdException w:name="Note Heading" w:semiHidden="1" w:unhideWhenUsed="1"/>
-    <w:lsdException w:name="Body Text 2" w:semiHidden="1" w:unhideWhenUsed="1"/>
-    <w:lsdException w:name="Body Text 3" w:semiHidden="1" w:unhideWhenUsed="1"/>
-    <w:lsdException w:name="Body Text Indent 2" w:semiHidden="1" w:unhideWhenUsed="1"/>
-    <w:lsdException w:name="Body Text Indent 3" w:semiHidden="1" w:unhideWhenUsed="1"/>
-    <w:lsdException w:name="Block Text" w:semiHidden="1" w:unhideWhenUsed="1"/>
-    <w:lsdException w:name="Hyperlink" w:semiHidden="1" w:unhideWhenUsed="1"/>
-    <w:lsdException w:name="FollowedHyperlink" w:semiHidden="1" w:unhideWhenUsed="1"/>
-    <w:lsdException w:name="Strong" w:uiPriority="22" w:qFormat="1"/>
-    <w:lsdException w:name="Emphasis" w:uiPriority="20" w:qFormat="1"/>
-    <w:lsdException w:name="Document Map" w:semiHidden="1" w:unhideWhenUsed="1"/>
-    <w:lsdException w:name="Plain Text" w:semiHidden="1" w:unhideWhenUsed="1"/>
-    <w:lsdException w:name="E-mail Signature" w:semiHidden="1" w:unhideWhenUsed="1"/>
-    <w:lsdException w:name="HTML Top of Form" w:semiHidden="1" w:unhideWhenUsed="1"/>
-    <w:lsdException w:name="HTML Bottom of Form" w:semiHidden="1" w:unhideWhenUsed="1"/>
-    <w:lsdException w:name="Normal (Web)" w:semiHidden="1" w:unhideWhenUsed="1"/>
-    <w:lsdException w:name="HTML Acronym" w:semiHidden="1" w:unhideWhenUsed="1"/>
-    <w:lsdException w:name="HTML Address" w:semiHidden="1" w:unhideWhenUsed="1"/>
-    <w:lsdException w:name="HTML Cite" w:semiHidden="1" w:unhideWhenUsed="1"/>
-    <w:lsdException w:name="HTML Code" w:semiHidden="1" w:unhideWhenUsed="1"/>
-    <w:lsdException w:name="HTML Definition" w:semiHidden="1" w:unhideWhenUsed="1"/>
-    <w:lsdException w:name="HTML Keyboard" w:semiHidden="1" w:unhideWhenUsed="1"/>
-    <w:lsdException w:name="HTML Preformatted" w:semiHidden="1" w:unhideWhenUsed="1"/>
-    <w:lsdException w:name="HTML Sample" w:semiHidden="1" w:unhideWhenUsed="1"/>
-    <w:lsdException w:name="HTML Typewriter" w:semiHidden="1" w:unhideWhenUsed="1"/>
-    <w:lsdException w:name="HTML Variable" w:semiHidden="1" w:unhideWhenUsed="1"/>
-    <w:lsdException w:name="Normal Table" w:semiHidden="1" w:unhideWhenUsed="1"/>
-    <w:lsdException w:name="annotation subject" w:semiHidden="1" w:unhideWhenUsed="1"/>
-    <w:lsdException w:name="No List" w:semiHidden="1" w:unhideWhenUsed="1"/>
-    <w:lsdException w:name="Outline List 1" w:semiHidden="1" w:unhideWhenUsed="1"/>
-    <w:lsdException w:name="Outline List 2" w:semiHidden="1" w:unhideWhenUsed="1"/>
-    <w:lsdException w:name="Outline List 3" w:semiHidden="1" w:unhideWhenUsed="1"/>
-    <w:lsdException w:name="Table Simple 1" w:semiHidden="1" w:unhideWhenUsed="1"/>
-    <w:lsdException w:name="Table Simple 2" w:semiHidden="1" w:unhideWhenUsed="1"/>
-    <w:lsdException w:name="Table Simple 3" w:semiHidden="1" w:unhideWhenUsed="1"/>
-    <w:lsdException w:name="Table Classic 1" w:semiHidden="1" w:unhideWhenUsed="1"/>
-    <w:lsdException w:name="Table Classic 2" w:semiHidden="1" w:unhideWhenUsed="1"/>
-    <w:lsdException w:name="Table Classic 3" w:semiHidden="1" w:unhideWhenUsed="1"/>
-    <w:lsdException w:name="Table Classic 4" w:semiHidden="1" w:unhideWhenUsed="1"/>
-    <w:lsdException w:name="Table Colorful 1" w:semiHidden="1" w:unhideWhenUsed="1"/>
-    <w:lsdException w:name="Table Colorful 2" w:semiHidden="1" w:unhideWhenUsed="1"/>
-    <w:lsdException w:name="Table Colorful 3" w:semiHidden="1" w:unhideWhenUsed="1"/>
-    <w:lsdException w:name="Table Columns 1" w:semiHidden="1" w:unhideWhenUsed="1"/>
-    <w:lsdException w:name="Table Columns 2" w:semiHidden="1" w:unhideWhenUsed="1"/>
-    <w:lsdException w:name="Table Columns 3" w:semiHidden="1" w:unhideWhenUsed="1"/>
-    <w:lsdException w:name="Table Columns 4" w:semiHidden="1" w:unhideWhenUsed="1"/>
-    <w:lsdException w:name="Table Columns 5" w:semiHidden="1" w:unhideWhenUsed="1"/>
-    <w:lsdException w:name="Table Grid 1" w:semiHidden="1" w:unhideWhenUsed="1"/>
-    <w:lsdException w:name="Table Grid 2" w:semiHidden="1" w:unhideWhenUsed="1"/>
-    <w:lsdException w:name="Table Grid 3" w:semiHidden="1" w:unhideWhenUsed="1"/>
-    <w:lsdException w:name="Table Grid 4" w:semiHidden="1" w:unhideWhenUsed="1"/>
-    <w:lsdException w:name="Table Grid 5" w:semiHidden="1" w:unhideWhenUsed="1"/>
-    <w:lsdException w:name="Table Grid 6" w:semiHidden="1" w:unhideWhenUsed="1"/>
-    <w:lsdException w:name="Table Grid 7" w:semiHidden="1" w:unhideWhenUsed="1"/>
-    <w:lsdException w:name="Table Grid 8" w:semiHidden="1" w:unhideWhenUsed="1"/>
-    <w:lsdException w:name="Table List 1" w:semiHidden="1" w:unhideWhenUsed="1"/>
-    <w:lsdException w:name="Table List 2" w:semiHidden="1" w:unhideWhenUsed="1"/>
-    <w:lsdException w:name="Table List 3" w:semiHidden="1" w:unhideWhenUsed="1"/>
-    <w:lsdException w:name="Table List 4" w:semiHidden="1" w:unhideWhenUsed="1"/>
-    <w:lsdException w:name="Table List 5" w:semiHidden="1" w:unhideWhenUsed="1"/>
-    <w:lsdException w:name="Table List 6" w:semiHidden="1" w:unhideWhenUsed="1"/>
-    <w:lsdException w:name="Table List 7" w:semiHidden="1" w:unhideWhenUsed="1"/>
-    <w:lsdException w:name="Table List 8" w:semiHidden="1" w:unhideWhenUsed="1"/>
-    <w:lsdException w:name="Table 3D effects 1" w:semiHidden="1" w:unhideWhenUsed="1"/>
-    <w:lsdException w:name="Table 3D effects 2" w:semiHidden="1" w:unhideWhenUsed="1"/>
-    <w:lsdException w:name="Table 3D effects 3" w:semiHidden="1" w:unhideWhenUsed="1"/>
-    <w:lsdException w:name="Table Contemporary" w:semiHidden="1" w:unhideWhenUsed="1"/>
-    <w:lsdException w:name="Table Elegant" w:semiHidden="1" w:unhideWhenUsed="1"/>
-    <w:lsdException w:name="Table Professional" w:semiHidden="1" w:unhideWhenUsed="1"/>
-    <w:lsdException w:name="Table Subtle 1" w:semiHidden="1" w:unhideWhenUsed="1"/>
-    <w:lsdException w:name="Table Subtle 2" w:semiHidden="1" w:unhideWhenUsed="1"/>
-    <w:lsdException w:name="Table Web 1" w:semiHidden="1" w:unhideWhenUsed="1"/>
-    <w:lsdException w:name="Table Web 2" w:semiHidden="1" w:unhideWhenUsed="1"/>
-    <w:lsdException w:name="Table Web 3" w:semiHidden="1" w:unhideWhenUsed="1"/>
-    <w:lsdException w:name="Balloon Text" w:semiHidden="1" w:unhideWhenUsed="1"/>
-    <w:lsdException w:name="Table Grid" w:uiPriority="39"/>
-    <w:lsdException w:name="Table Theme" w:semiHidden="1" w:unhideWhenUsed="1"/>
-    <w:lsdException w:name="Placeholder Text" w:semiHidden="1"/>
-    <w:lsdException w:name="No Spacing" w:uiPriority="1" w:qFormat="1"/>
-    <w:lsdException w:name="Light Shading" w:uiPriority="60"/>
-    <w:lsdException w:name="Light List" w:uiPriority="61"/>
-    <w:lsdException w:name="Light Grid" w:uiPriority="62"/>
-    <w:lsdException w:name="Medium Shading 1" w:uiPriority="63"/>
-    <w:lsdException w:name="Medium Shading 2" w:uiPriority="64"/>
-    <w:lsdException w:name="Medium List 1" w:uiPriority="65"/>
-    <w:lsdException w:name="Medium List 2" w:uiPriority="66"/>
-    <w:lsdException w:name="Medium Grid 1" w:uiPriority="67"/>
-    <w:lsdException w:name="Medium Grid 2" w:uiPriority="68"/>
-    <w:lsdException w:name="Medium Grid 3" w:uiPriority="69"/>
-    <w:lsdException w:name="Dark List" w:uiPriority="70"/>
-    <w:lsdException w:name="Colorful Shading" w:uiPriority="71"/>
-    <w:lsdException w:name="Colorful List" w:uiPriority="72"/>
-    <w:lsdException w:name="Colorful Grid" w:uiPriority="73"/>
-    <w:lsdException w:name="Light Shading Accent 1" w:uiPriority="60"/>
-    <w:lsdException w:name="Light List Accent 1" w:uiPriority="61"/>
-    <w:lsdException w:name="Light Grid Accent 1" w:uiPriority="62"/>
-    <w:lsdException w:name="Medium Shading 1 Accent 1" w:uiPriority="63"/>
-    <w:lsdException w:name="Medium Shading 2 Accent 1" w:uiPriority="64"/>
-    <w:lsdException w:name="Medium List 1 Accent 1" w:uiPriority="65"/>
-    <w:lsdException w:name="Revision" w:semiHidden="1"/>
-    <w:lsdException w:name="List Paragraph" w:uiPriority="34" w:qFormat="1"/>
-    <w:lsdException w:name="Quote" w:uiPriority="29" w:qFormat="1"/>
-    <w:lsdException w:name="Intense Quote" w:uiPriority="30" w:qFormat="1"/>
-    <w:lsdException w:name="Medium List 2 Accent 1" w:uiPriority="66"/>
-    <w:lsdException w:name="Medium Grid 1 Accent 1" w:uiPriority="67"/>
-    <w:lsdException w:name="Medium Grid 2 Accent 1" w:uiPriority="68"/>
-    <w:lsdException w:name="Medium Grid 3 Accent 1" w:uiPriority="69"/>
-    <w:lsdException w:name="Dark List Accent 1" w:uiPriority="70"/>
-    <w:lsdException w:name="Colorful Shading Accent 1" w:uiPriority="71"/>
-    <w:lsdException w:name="Colorful List Accent 1" w:uiPriority="72"/>
-    <w:lsdException w:name="Colorful Grid Accent 1" w:uiPriority="73"/>
-    <w:lsdException w:name="Light Shading Accent 2" w:uiPriority="60"/>
-    <w:lsdException w:name="Light List Accent 2" w:uiPriority="61"/>
-    <w:lsdException w:name="Light Grid Accent 2" w:uiPriority="62"/>
-    <w:lsdException w:name="Medium Shading 1 Accent 2" w:uiPriority="63"/>
-    <w:lsdException w:name="Medium Shading 2 Accent 2" w:uiPriority="64"/>
-    <w:lsdException w:name="Medium List 1 Accent 2" w:uiPriority="65"/>
-    <w:lsdException w:name="Medium List 2 Accent 2" w:uiPriority="66"/>
-    <w:lsdException w:name="Medium Grid 1 Accent 2" w:uiPriority="67"/>
-    <w:lsdException w:name="Medium Grid 2 Accent 2" w:uiPriority="68"/>
-    <w:lsdException w:name="Medium Grid 3 Accent 2" w:uiPriority="69"/>
-    <w:lsdException w:name="Dark List Accent 2" w:uiPriority="70"/>
-    <w:lsdException w:name="Colorful Shading Accent 2" w:uiPriority="71"/>
-    <w:lsdException w:name="Colorful List Accent 2" w:uiPriority="72"/>
-    <w:lsdException w:name="Colorful Grid Accent 2" w:uiPriority="73"/>
-    <w:lsdException w:name="Light Shading Accent 3" w:uiPriority="60"/>
-    <w:lsdException w:name="Light List Accent 3" w:uiPriority="61"/>
-    <w:lsdException w:name="Light Grid Accent 3" w:uiPriority="62"/>
-    <w:lsdException w:name="Medium Shading 1 Accent 3" w:uiPriority="63"/>
-    <w:lsdException w:name="Medium Shading 2 Accent 3" w:uiPriority="64"/>
-    <w:lsdException w:name="Medium List 1 Accent 3" w:uiPriority="65"/>
-    <w:lsdException w:name="Medium List 2 Accent 3" w:uiPriority="66"/>
-    <w:lsdException w:name="Medium Grid 1 Accent 3" w:uiPriority="67"/>
-    <w:lsdException w:name="Medium Grid 2 Accent 3" w:uiPriority="68"/>
-    <w:lsdException w:name="Medium Grid 3 Accent 3" w:uiPriority="69"/>
-    <w:lsdException w:name="Dark List Accent 3" w:uiPriority="70"/>
-    <w:lsdException w:name="Colorful Shading Accent 3" w:uiPriority="71"/>
-    <w:lsdException w:name="Colorful List Accent 3" w:uiPriority="72"/>
-    <w:lsdException w:name="Colorful Grid Accent 3" w:uiPriority="73"/>
-    <w:lsdException w:name="Light Shading Accent 4" w:uiPriority="60"/>
-    <w:lsdException w:name="Light List Accent 4" w:uiPriority="61"/>
-    <w:lsdException w:name="Light Grid Accent 4" w:uiPriority="62"/>
-    <w:lsdException w:name="Medium Shading 1 Accent 4" w:uiPriority="63"/>
-    <w:lsdException w:name="Medium Shading 2 Accent 4" w:uiPriority="64"/>
-    <w:lsdException w:name="Medium List 1 Accent 4" w:uiPriority="65"/>
-    <w:lsdException w:name="Medium List 2 Accent 4" w:uiPriority="66"/>
-    <w:lsdException w:name="Medium Grid 1 Accent 4" w:uiPriority="67"/>
-    <w:lsdException w:name="Medium Grid 2 Accent 4" w:uiPriority="68"/>
-    <w:lsdException w:name="Medium Grid 3 Accent 4" w:uiPriority="69"/>
-    <w:lsdException w:name="Dark List Accent 4" w:uiPriority="70"/>
-    <w:lsdException w:name="Colorful Shading Accent 4" w:uiPriority="71"/>
-    <w:lsdException w:name="Colorful List Accent 4" w:uiPriority="72"/>
-    <w:lsdException w:name="Colorful Grid Accent 4" w:uiPriority="73"/>
-    <w:lsdException w:name="Light Shading Accent 5" w:uiPriority="60"/>
-    <w:lsdException w:name="Light List Accent 5" w:uiPriority="61"/>
-    <w:lsdException w:name="Light Grid Accent 5" w:uiPriority="62"/>
-    <w:lsdException w:name="Medium Shading 1 Accent 5" w:uiPriority="63"/>
-    <w:lsdException w:name="Medium Shading 2 Accent 5" w:uiPriority="64"/>
-    <w:lsdException w:name="Medium List 1 Accent 5" w:uiPriority="65"/>
-    <w:lsdException w:name="Medium List 2 Accent 5" w:uiPriority="66"/>
-    <w:lsdException w:name="Medium Grid 1 Accent 5" w:uiPriority="67"/>
-    <w:lsdException w:name="Medium Grid 2 Accent 5" w:uiPriority="68"/>
-    <w:lsdException w:name="Medium Grid 3 Accent 5" w:uiPriority="69"/>
-    <w:lsdException w:name="Dark List Accent 5" w:uiPriority="70"/>
-    <w:lsdException w:name="Colorful Shading Accent 5" w:uiPriority="71"/>
-    <w:lsdException w:name="Colorful List Accent 5" w:uiPriority="72"/>
-    <w:lsdException w:name="Colorful Grid Accent 5" w:uiPriority="73"/>
-    <w:lsdException w:name="Light Shading Accent 6" w:uiPriority="60"/>
-    <w:lsdException w:name="Light List Accent 6" w:uiPriority="61"/>
-    <w:lsdException w:name="Light Grid Accent 6" w:uiPriority="62"/>
-    <w:lsdException w:name="Medium Shading 1 Accent 6" w:uiPriority="63"/>
-    <w:lsdException w:name="Medium Shading 2 Accent 6" w:uiPriority="64"/>
-    <w:lsdException w:name="Medium List 1 Accent 6" w:uiPriority="65"/>
-    <w:lsdException w:name="Medium List 2 Accent 6" w:uiPriority="66"/>
-    <w:lsdException w:name="Medium Grid 1 Accent 6" w:uiPriority="67"/>
-    <w:lsdException w:name="Medium Grid 2 Accent 6" w:uiPriority="68"/>
-    <w:lsdException w:name="Medium Grid 3 Accent 6" w:uiPriority="69"/>
-    <w:lsdException w:name="Dark List Accent 6" w:uiPriority="70"/>
-    <w:lsdException w:name="Colorful Shading Accent 6" w:uiPriority="71"/>
-    <w:lsdException w:name="Colorful List Accent 6" w:uiPriority="72"/>
-    <w:lsdException w:name="Colorful Grid Accent 6" w:uiPriority="73"/>
-    <w:lsdException w:name="Subtle Emphasis" w:uiPriority="19" w:qFormat="1"/>
-    <w:lsdException w:name="Intense Emphasis" w:uiPriority="21" w:qFormat="1"/>
-    <w:lsdException w:name="Subtle Reference" w:uiPriority="31" w:qFormat="1"/>
-    <w:lsdException w:name="Intense Reference" w:uiPriority="32" w:qFormat="1"/>
-    <w:lsdException w:name="Book Title" w:uiPriority="33" w:qFormat="1"/>
-    <w:lsdException w:name="Bibliography" w:semiHidden="1" w:uiPriority="37" w:unhideWhenUsed="1"/>
-    <w:lsdException w:name="TOC Heading" w:semiHidden="1" w:uiPriority="39" w:unhideWhenUsed="1" w:qFormat="1"/>
-    <w:lsdException w:name="Plain Table 1" w:uiPriority="41"/>
-    <w:lsdException w:name="Plain Table 2" w:uiPriority="42"/>
-    <w:lsdException w:name="Plain Table 3" w:uiPriority="43"/>
-    <w:lsdException w:name="Plain Table 4" w:uiPriority="44"/>
-    <w:lsdException w:name="Plain Table 5" w:uiPriority="45"/>
-    <w:lsdException w:name="Grid Table Light" w:uiPriority="40"/>
-    <w:lsdException w:name="Grid Table 1 Light" w:uiPriority="46"/>
-    <w:lsdException w:name="Grid Table 2" w:uiPriority="47"/>
-    <w:lsdException w:name="Grid Table 3" w:uiPriority="48"/>
-    <w:lsdException w:name="Grid Table 4" w:uiPriority="49"/>
-    <w:lsdException w:name="Grid Table 5 Dark" w:uiPriority="50"/>
-    <w:lsdException w:name="Grid Table 6 Colorful" w:uiPriority="51"/>
-    <w:lsdException w:name="Grid Table 7 Colorful" w:uiPriority="52"/>
-    <w:lsdException w:name="Grid Table 1 Light Accent 1" w:uiPriority="46"/>
-    <w:lsdException w:name="Grid Table 2 Accent 1" w:uiPriority="47"/>
-    <w:lsdException w:name="Grid Table 3 Accent 1" w:uiPriority="48"/>
-    <w:lsdException w:name="Grid Table 4 Accent 1" w:uiPriority="49"/>
-    <w:lsdException w:name="Grid Table 5 Dark Accent 1" w:uiPriority="50"/>
-    <w:lsdException w:name="Grid Table 6 Colorful Accent 1" w:uiPriority="51"/>
-    <w:lsdException w:name="Grid Table 7 Colorful Accent 1" w:uiPriority="52"/>
-    <w:lsdException w:name="Grid Table 1 Light Accent 2" w:uiPriority="46"/>
-    <w:lsdException w:name="Grid Table 2 Accent 2" w:uiPriority="47"/>
-    <w:lsdException w:name="Grid Table 3 Accent 2" w:uiPriority="48"/>
-    <w:lsdException w:name="Grid Table 4 Accent 2" w:uiPriority="49"/>
-    <w:lsdException w:name="Grid Table 5 Dark Accent 2" w:uiPriority="50"/>
-    <w:lsdException w:name="Grid Table 6 Colorful Accent 2" w:uiPriority="51"/>
-    <w:lsdException w:name="Grid Table 7 Colorful Accent 2" w:uiPriority="52"/>
-    <w:lsdException w:name="Grid Table 1 Light Accent 3" w:uiPriority="46"/>
-    <w:lsdException w:name="Grid Table 2 Accent 3" w:uiPriority="47"/>
-    <w:lsdException w:name="Grid Table 3 Accent 3" w:uiPriority="48"/>
-    <w:lsdException w:name="Grid Table 4 Accent 3" w:uiPriority="49"/>
-    <w:lsdException w:name="Grid Table 5 Dark Accent 3" w:uiPriority="50"/>
-    <w:lsdException w:name="Grid Table 6 Colorful Accent 3" w:uiPriority="51"/>
-    <w:lsdException w:name="Grid Table 7 Colorful Accent 3" w:uiPriority="52"/>
-    <w:lsdException w:name="Grid Table 1 Light Accent 4" w:uiPriority="46"/>
-    <w:lsdException w:name="Grid Table 2 Accent 4" w:uiPriority="47"/>
-    <w:lsdException w:name="Grid Table 3 Accent 4" w:uiPriority="48"/>
-    <w:lsdException w:name="Grid Table 4 Accent 4" w:uiPriority="49"/>
-    <w:lsdException w:name="Grid Table 5 Dark Accent 4" w:uiPriority="50"/>
-    <w:lsdException w:name="Grid Table 6 Colorful Accent 4" w:uiPriority="51"/>
-    <w:lsdException w:name="Grid Table 7 Colorful Accent 4" w:uiPriority="52"/>
-    <w:lsdException w:name="Grid Table 1 Light Accent 5" w:uiPriority="46"/>
-    <w:lsdException w:name="Grid Table 2 Accent 5" w:uiPriority="47"/>
-    <w:lsdException w:name="Grid Table 3 Accent 5" w:uiPriority="48"/>
-    <w:lsdException w:name="Grid Table 4 Accent 5" w:uiPriority="49"/>
-    <w:lsdException w:name="Grid Table 5 Dark Accent 5" w:uiPriority="50"/>
-    <w:lsdException w:name="Grid Table 6 Colorful Accent 5" w:uiPriority="51"/>
-    <w:lsdException w:name="Grid Table 7 Colorful Accent 5" w:uiPriority="52"/>
-    <w:lsdException w:name="Grid Table 1 Light Accent 6" w:uiPriority="46"/>
-    <w:lsdException w:name="Grid Table 2 Accent 6" w:uiPriority="47"/>
-    <w:lsdException w:name="Grid Table 3 Accent 6" w:uiPriority="48"/>
-    <w:lsdException w:name="Grid Table 4 Accent 6" w:uiPriority="49"/>
-    <w:lsdException w:name="Grid Table 5 Dark Accent 6" w:uiPriority="50"/>
-    <w:lsdException w:name="Grid Table 6 Colorful Accent 6" w:uiPriority="51"/>
-    <w:lsdException w:name="Grid Table 7 Colorful Accent 6" w:uiPriority="52"/>
-    <w:lsdException w:name="List Table 1 Light" w:uiPriority="46"/>
-    <w:lsdException w:name="List Table 2" w:uiPriority="47"/>
-    <w:lsdException w:name="List Table 3" w:uiPriority="48"/>
-    <w:lsdException w:name="List Table 4" w:uiPriority="49"/>
-    <w:lsdException w:name="List Table 5 Dark" w:uiPriority="50"/>
-    <w:lsdException w:name="List Table 6 Colorful" w:uiPriority="51"/>
-    <w:lsdException w:name="List Table 7 Colorful" w:uiPriority="52"/>
-    <w:lsdException w:name="List Table 1 Light Accent 1" w:uiPriority="46"/>
-    <w:lsdException w:name="List Table 2 Accent 1" w:uiPriority="47"/>
-    <w:lsdException w:name="List Table 3 Accent 1" w:uiPriority="48"/>
-    <w:lsdException w:name="List Table 4 Accent 1" w:uiPriority="49"/>
-    <w:lsdException w:name="List Table 5 Dark Accent 1" w:uiPriority="50"/>
-    <w:lsdException w:name="List Table 6 Colorful Accent 1" w:uiPriority="51"/>
-    <w:lsdException w:name="List Table 7 Colorful Accent 1" w:uiPriority="52"/>
-    <w:lsdException w:name="List Table 1 Light Accent 2" w:uiPriority="46"/>
-    <w:lsdException w:name="List Table 2 Accent 2" w:uiPriority="47"/>
-    <w:lsdException w:name="List Table 3 Accent 2" w:uiPriority="48"/>
-    <w:lsdException w:name="List Table 4 Accent 2" w:uiPriority="49"/>
-    <w:lsdException w:name="List Table 5 Dark Accent 2" w:uiPriority="50"/>
-    <w:lsdException w:name="List Table 6 Colorful Accent 2" w:uiPriority="51"/>
-    <w:lsdException w:name="List Table 7 Colorful Accent 2" w:uiPriority="52"/>
-    <w:lsdException w:name="List Table 1 Light Accent 3" w:uiPriority="46"/>
-    <w:lsdException w:name="List Table 2 Accent 3" w:uiPriority="47"/>
-    <w:lsdException w:name="List Table 3 Accent 3" w:uiPriority="48"/>
-    <w:lsdException w:name="List Table 4 Accent 3" w:uiPriority="49"/>
-    <w:lsdException w:name="List Table 5 Dark Accent 3" w:uiPriority="50"/>
-    <w:lsdException w:name="List Table 6 Colorful Accent 3" w:uiPriority="51"/>
-    <w:lsdException w:name="List Table 7 Colorful Accent 3" w:uiPriority="52"/>
-    <w:lsdException w:name="List Table 1 Light Accent 4" w:uiPriority="46"/>
-    <w:lsdException w:name="List Table 2 Accent 4" w:uiPriority="47"/>
-    <w:lsdException w:name="List Table 3 Accent 4" w:uiPriority="48"/>
-    <w:lsdException w:name="List Table 4 Accent 4" w:uiPriority="49"/>
-    <w:lsdException w:name="List Table 5 Dark Accent 4" w:uiPriority="50"/>
-    <w:lsdException w:name="List Table 6 Colorful Accent 4" w:uiPriority="51"/>
-    <w:lsdException w:name="List Table 7 Colorful Accent 4" w:uiPriority="52"/>
-    <w:lsdException w:name="List Table 1 Light Accent 5" w:uiPriority="46"/>
-    <w:lsdException w:name="List Table 2 Accent 5" w:uiPriority="47"/>
-    <w:lsdException w:name="List Table 3 Accent 5" w:uiPriority="48"/>
-    <w:lsdException w:name="List Table 4 Accent 5" w:uiPriority="49"/>
-    <w:lsdException w:name="List Table 5 Dark Accent 5" w:uiPriority="50"/>
-    <w:lsdException w:name="List Table 6 Colorful Accent 5" w:uiPriority="51"/>
-    <w:lsdException w:name="List Table 7 Colorful Accent 5" w:uiPriority="52"/>
-    <w:lsdException w:name="List Table 1 Light Accent 6" w:uiPriority="46"/>
-    <w:lsdException w:name="List Table 2 Accent 6" w:uiPriority="47"/>
-    <w:lsdException w:name="List Table 3 Accent 6" w:uiPriority="48"/>
-    <w:lsdException w:name="List Table 4 Accent 6" w:uiPriority="49"/>
-    <w:lsdException w:name="List Table 5 Dark Accent 6" w:uiPriority="50"/>
-    <w:lsdException w:name="List Table 6 Colorful Accent 6" w:uiPriority="51"/>
-    <w:lsdException w:name="List Table 7 Colorful Accent 6" w:uiPriority="52"/>
-    <w:lsdException w:name="Mention" w:semiHidden="1" w:unhideWhenUsed="1"/>
-    <w:lsdException w:name="Smart Hyperlink" w:semiHidden="1" w:unhideWhenUsed="1"/>
-    <w:lsdException w:name="Hashtag" w:semiHidden="1" w:unhideWhenUsed="1"/>
-    <w:lsdException w:name="Unresolved Mention" w:semiHidden="1" w:unhideWhenUsed="1"/>
-    <w:lsdException w:name="Smart Link" w:semiHidden="1" w:unhideWhenUsed="1"/>
-  </w:latentStyles>
-  <w:style w:type="paragraph" w:default="1" w:styleId="Normal">
-    <w:name w:val="Normal"/>
-    <w:qFormat/>
-  </w:style>
-  <w:style w:type="character" w:default="1" w:styleId="DefaultParagraphFont">
-    <w:name w:val="Default Paragraph Font"/>
-    <w:uiPriority w:val="1"/>
-    <w:semiHidden/>
-    <w:unhideWhenUsed/>
-  </w:style>
-  <w:style w:type="table" w:default="1" w:styleId="TableNormal">
-    <w:name w:val="Normal Table"/>
-    <w:uiPriority w:val="99"/>
-    <w:semiHidden/>
-    <w:unhideWhenUsed/>
-    <w:tblPr>
-      <w:tblInd w:w="0" w:type="dxa"/>
-      <w:tblCellMar>
-        <w:top w:w="0" w:type="dxa"/>
-        <w:left w:w="108" w:type="dxa"/>
-        <w:bottom w:w="0" w:type="dxa"/>
-        <w:right w:w="108" w:type="dxa"/>
-      </w:tblCellMar>
-    </w:tblPr>
-  </w:style>
-  <w:style w:type="numbering" w:default="1" w:styleId="NoList">
-    <w:name w:val="No List"/>
-    <w:uiPriority w:val="99"/>
-    <w:semiHidden/>
-    <w:unhideWhenUsed/>
-  </w:style>
-  <w:style w:type="character" w:styleId="PlaceholderText">
-    <w:name w:val="Placeholder Text"/>
-    <w:basedOn w:val="DefaultParagraphFont"/>
-    <w:uiPriority w:val="99"/>
-    <w:semiHidden/>
-    <w:rsid w:val="0060203E"/>
-    <w:rPr>
-      <w:color w:val="666666"/>
-    </w:rPr>
-  </w:style>
-  <w:style w:type="paragraph" w:customStyle="1" w:styleId="8BBDCC4D00756E45BDCA6EB80A2E474B">
-    <w:name w:val="8BBDCC4D00756E45BDCA6EB80A2E474B"/>
-    <w:rsid w:val="0060203E"/>
-  </w:style>
-  <w:style w:type="paragraph" w:customStyle="1" w:styleId="1105933E8614794DB18B68A0B150C3F8">
-    <w:name w:val="1105933E8614794DB18B68A0B150C3F8"/>
-    <w:rsid w:val="0060203E"/>
-  </w:style>
-</w:styles>
-</file>
-
-<file path=word/glossary/webSettings.xml><?xml version="1.0" encoding="utf-8"?>
-<w:webSettings xmlns:mc="http://schemas.openxmlformats.org/markup-compatibility/2006" xmlns:r="http://schemas.openxmlformats.org/officeDocument/2006/relationships" xmlns:w="http://schemas.openxmlformats.org/wordprocessingml/2006/main" xmlns:w14="http://schemas.microsoft.com/office/word/2010/wordml" xmlns:w15="http://schemas.microsoft.com/office/word/2012/wordml" xmlns:w16cex="http://schemas.microsoft.com/office/word/2018/wordml/cex" xmlns:w16cid="http://schemas.microsoft.com/office/word/2016/wordml/cid" xmlns:w16="http://schemas.microsoft.com/office/word/2018/wordml" xmlns:w16du="http://schemas.microsoft.com/office/word/2023/wordml/word16du" xmlns:w16sdtdh="http://schemas.microsoft.com/office/word/2020/wordml/sdtdatahash" xmlns:w16sdtfl="http://schemas.microsoft.com/office/word/2024/wordml/sdtformatlock" xmlns:w16se="http://schemas.microsoft.com/office/word/2015/wordml/symex" mc:Ignorable="w14 w15 w16se w16cid w16 w16cex w16sdtdh w16sdtfl w16du">
-  <w:optimizeForBrowser/>
-  <w:allowPNG/>
-</w:webSettings>
-</file>
-
 <file path=word/theme/theme1.xml><?xml version="1.0" encoding="utf-8"?>
 <a:theme xmlns:a="http://schemas.openxmlformats.org/drawingml/2006/main" name="Office Theme">
   <a:themeElements>

</xml_diff>